<commit_message>
added page numbers in v6
</commit_message>
<xml_diff>
--- a/PHASE 1 REPORT/Report Draft/PROJECT PHASE_I REPORT v5.docx
+++ b/PHASE 1 REPORT/Report Draft/PROJECT PHASE_I REPORT v5.docx
@@ -1463,7 +1463,6 @@
         <w:t xml:space="preserve">the award of </w:t>
       </w:r>
       <w:proofErr w:type="spellStart"/>
-      <w:proofErr w:type="gramStart"/>
       <w:r>
         <w:rPr>
           <w:rFonts w:ascii="Times New Roman" w:hAnsi="Times New Roman"/>
@@ -1474,7 +1473,6 @@
         <w:t>B.Tech</w:t>
       </w:r>
       <w:proofErr w:type="spellEnd"/>
-      <w:proofErr w:type="gramEnd"/>
       <w:r>
         <w:rPr>
           <w:rFonts w:ascii="Times New Roman" w:hAnsi="Times New Roman"/>
@@ -2033,25 +2031,7 @@
           <w:sz w:val="24"/>
           <w:szCs w:val="24"/>
         </w:rPr>
-        <w:t xml:space="preserve"> who have been by our side always and helped us with our project.  We also sincerely thank all the lab technicians for their help as </w:t>
-      </w:r>
-      <w:proofErr w:type="gramStart"/>
-      <w:r>
-        <w:rPr>
-          <w:rFonts w:ascii="Times New Roman" w:hAnsi="Times New Roman"/>
-          <w:sz w:val="24"/>
-          <w:szCs w:val="24"/>
-        </w:rPr>
-        <w:t>in the course of</w:t>
-      </w:r>
-      <w:proofErr w:type="gramEnd"/>
-      <w:r>
-        <w:rPr>
-          <w:rFonts w:ascii="Times New Roman" w:hAnsi="Times New Roman"/>
-          <w:sz w:val="24"/>
-          <w:szCs w:val="24"/>
-        </w:rPr>
-        <w:t xml:space="preserve"> our project development.</w:t>
+        <w:t xml:space="preserve"> who have been by our side always and helped us with our project.  We also sincerely thank all the lab technicians for their help as in the course of our project development.</w:t>
       </w:r>
     </w:p>
     <w:p>
@@ -2090,23 +2070,13 @@
         <w:tab/>
         <w:t xml:space="preserve">We would also like to extend our sincere gratitude and grateful thanks to our </w:t>
       </w:r>
-      <w:proofErr w:type="gramStart"/>
-      <w:r>
-        <w:rPr>
-          <w:rFonts w:ascii="Times New Roman" w:hAnsi="Times New Roman"/>
-          <w:sz w:val="24"/>
-          <w:szCs w:val="24"/>
-        </w:rPr>
-        <w:t>Principal</w:t>
-      </w:r>
-      <w:proofErr w:type="gramEnd"/>
-      <w:r>
-        <w:rPr>
-          <w:rFonts w:ascii="Times New Roman" w:hAnsi="Times New Roman"/>
-          <w:sz w:val="24"/>
-          <w:szCs w:val="24"/>
-        </w:rPr>
-        <w:t xml:space="preserve">, </w:t>
+      <w:r>
+        <w:rPr>
+          <w:rFonts w:ascii="Times New Roman" w:hAnsi="Times New Roman"/>
+          <w:sz w:val="24"/>
+          <w:szCs w:val="24"/>
+        </w:rPr>
+        <w:t xml:space="preserve">Principal, </w:t>
       </w:r>
       <w:r>
         <w:rPr>
@@ -8855,10 +8825,28 @@
         </w:rPr>
         <w:t>46</w:t>
       </w:r>
-      <w:r>
-        <w:rPr>
-          <w:rFonts w:ascii="Times New Roman" w:hAnsi="Times New Roman"/>
-          <w:i/>
+    </w:p>
+    <w:p>
+      <w:pPr>
+        <w:spacing w:after="0" w:line="240" w:lineRule="auto"/>
+        <w:rPr>
+          <w:rFonts w:ascii="Times New Roman" w:hAnsi="Times New Roman"/>
+          <w:b/>
+          <w:sz w:val="24"/>
+          <w:szCs w:val="24"/>
+        </w:rPr>
+        <w:sectPr>
+          <w:footerReference w:type="default" r:id="rId9"/>
+          <w:pgSz w:w="12240" w:h="15840"/>
+          <w:pgMar w:top="994" w:right="1440" w:bottom="806" w:left="1440" w:header="720" w:footer="720" w:gutter="0"/>
+          <w:cols w:space="720"/>
+          <w:docGrid w:linePitch="360"/>
+        </w:sectPr>
+      </w:pPr>
+      <w:r>
+        <w:rPr>
+          <w:rFonts w:ascii="Times New Roman" w:hAnsi="Times New Roman"/>
+          <w:b/>
           <w:sz w:val="24"/>
           <w:szCs w:val="24"/>
         </w:rPr>
@@ -15984,6 +15972,62 @@
           <w:szCs w:val="24"/>
         </w:rPr>
       </w:pPr>
+      <w:r>
+        <w:rPr>
+          <w:rFonts w:ascii="Times New Roman" w:hAnsi="Times New Roman"/>
+          <w:noProof/>
+          <w:sz w:val="24"/>
+          <w:szCs w:val="24"/>
+        </w:rPr>
+        <w:drawing>
+          <wp:inline distT="0" distB="0" distL="0" distR="0" wp14:anchorId="48E7C074" wp14:editId="023F30C2">
+            <wp:extent cx="5724525" cy="4886325"/>
+            <wp:effectExtent l="0" t="0" r="0" b="9525"/>
+            <wp:docPr id="455075919" name="Picture 4"/>
+            <wp:cNvGraphicFramePr>
+              <a:graphicFrameLocks xmlns:a="http://schemas.openxmlformats.org/drawingml/2006/main" noChangeAspect="1"/>
+            </wp:cNvGraphicFramePr>
+            <a:graphic xmlns:a="http://schemas.openxmlformats.org/drawingml/2006/main">
+              <a:graphicData uri="http://schemas.openxmlformats.org/drawingml/2006/picture">
+                <pic:pic xmlns:pic="http://schemas.openxmlformats.org/drawingml/2006/picture">
+                  <pic:nvPicPr>
+                    <pic:cNvPr id="0" name="Picture 4"/>
+                    <pic:cNvPicPr>
+                      <a:picLocks noChangeAspect="1" noChangeArrowheads="1"/>
+                    </pic:cNvPicPr>
+                  </pic:nvPicPr>
+                  <pic:blipFill>
+                    <a:blip r:embed="rId10" cstate="print">
+                      <a:extLst>
+                        <a:ext uri="{28A0092B-C50C-407E-A947-70E740481C1C}">
+                          <a14:useLocalDpi xmlns:a14="http://schemas.microsoft.com/office/drawing/2010/main" val="0"/>
+                        </a:ext>
+                      </a:extLst>
+                    </a:blip>
+                    <a:srcRect/>
+                    <a:stretch>
+                      <a:fillRect/>
+                    </a:stretch>
+                  </pic:blipFill>
+                  <pic:spPr bwMode="auto">
+                    <a:xfrm>
+                      <a:off x="0" y="0"/>
+                      <a:ext cx="5724525" cy="4886325"/>
+                    </a:xfrm>
+                    <a:prstGeom prst="rect">
+                      <a:avLst/>
+                    </a:prstGeom>
+                    <a:noFill/>
+                    <a:ln>
+                      <a:noFill/>
+                    </a:ln>
+                  </pic:spPr>
+                </pic:pic>
+              </a:graphicData>
+            </a:graphic>
+          </wp:inline>
+        </w:drawing>
+      </w:r>
     </w:p>
     <w:p>
       <w:pPr>
@@ -16115,10 +16159,341 @@
       <w:pPr>
         <w:spacing w:after="0" w:line="240" w:lineRule="auto"/>
         <w:ind w:left="360"/>
-        <w:rPr>
-          <w:rFonts w:ascii="Times New Roman" w:hAnsi="Times New Roman"/>
-          <w:b/>
-          <w:bCs/>
+        <w:jc w:val="both"/>
+        <w:rPr>
+          <w:rFonts w:ascii="Times New Roman" w:hAnsi="Times New Roman"/>
+          <w:iCs/>
+          <w:sz w:val="24"/>
+          <w:szCs w:val="24"/>
+        </w:rPr>
+      </w:pPr>
+      <w:r>
+        <w:rPr>
+          <w:rFonts w:ascii="Times New Roman" w:hAnsi="Times New Roman"/>
+          <w:iCs/>
+          <w:sz w:val="24"/>
+          <w:szCs w:val="24"/>
+        </w:rPr>
+        <w:t>I propose a Real-Time Wireframe Pothole Detection System that addresses the limitations of existing LiDAR-dependent approaches by using a camera-only, vision-based perception framework capable of real-time structural understanding of road surface anomalies. The proposed system eliminates the need for expensive depth sensors and complex calibration procedures while enabling accurate pothole detection, depth estimation, and geometric modeling suitable for autonomous navigation and intelligent transportation systems.</w:t>
+      </w:r>
+    </w:p>
+    <w:p>
+      <w:pPr>
+        <w:spacing w:after="0" w:line="240" w:lineRule="auto"/>
+        <w:ind w:left="360"/>
+        <w:jc w:val="both"/>
+        <w:rPr>
+          <w:rFonts w:ascii="Times New Roman" w:hAnsi="Times New Roman"/>
+          <w:iCs/>
+          <w:sz w:val="24"/>
+          <w:szCs w:val="24"/>
+        </w:rPr>
+      </w:pPr>
+      <w:r>
+        <w:rPr>
+          <w:rFonts w:ascii="Times New Roman" w:hAnsi="Times New Roman"/>
+          <w:iCs/>
+          <w:sz w:val="24"/>
+          <w:szCs w:val="24"/>
+        </w:rPr>
+        <w:t>The key components of the proposed system are outlined below:</w:t>
+      </w:r>
+    </w:p>
+    <w:p>
+      <w:pPr>
+        <w:numPr>
+          <w:ilvl w:val="0"/>
+          <w:numId w:val="14"/>
+        </w:numPr>
+        <w:spacing w:after="0" w:line="240" w:lineRule="auto"/>
+        <w:jc w:val="both"/>
+        <w:rPr>
+          <w:rFonts w:ascii="Times New Roman" w:hAnsi="Times New Roman"/>
+          <w:iCs/>
+          <w:sz w:val="24"/>
+          <w:szCs w:val="24"/>
+        </w:rPr>
+      </w:pPr>
+      <w:r>
+        <w:rPr>
+          <w:rFonts w:ascii="Times New Roman" w:hAnsi="Times New Roman"/>
+          <w:b/>
+          <w:bCs/>
+          <w:iCs/>
+          <w:sz w:val="24"/>
+          <w:szCs w:val="24"/>
+        </w:rPr>
+        <w:t>Image Acquisition:</w:t>
+      </w:r>
+      <w:r>
+        <w:rPr>
+          <w:rFonts w:ascii="Times New Roman" w:hAnsi="Times New Roman"/>
+          <w:iCs/>
+          <w:sz w:val="24"/>
+          <w:szCs w:val="24"/>
+        </w:rPr>
+        <w:t xml:space="preserve"> Real-time road surface images are captured using a single RGB camera mounted on the vehicle.</w:t>
+      </w:r>
+    </w:p>
+    <w:p>
+      <w:pPr>
+        <w:numPr>
+          <w:ilvl w:val="0"/>
+          <w:numId w:val="14"/>
+        </w:numPr>
+        <w:spacing w:after="0" w:line="240" w:lineRule="auto"/>
+        <w:jc w:val="both"/>
+        <w:rPr>
+          <w:rFonts w:ascii="Times New Roman" w:hAnsi="Times New Roman"/>
+          <w:iCs/>
+          <w:sz w:val="24"/>
+          <w:szCs w:val="24"/>
+        </w:rPr>
+      </w:pPr>
+      <w:r>
+        <w:rPr>
+          <w:rFonts w:ascii="Times New Roman" w:hAnsi="Times New Roman"/>
+          <w:b/>
+          <w:bCs/>
+          <w:iCs/>
+          <w:sz w:val="24"/>
+          <w:szCs w:val="24"/>
+        </w:rPr>
+        <w:t>Pothole Detection Module:</w:t>
+      </w:r>
+      <w:r>
+        <w:rPr>
+          <w:rFonts w:ascii="Times New Roman" w:hAnsi="Times New Roman"/>
+          <w:iCs/>
+          <w:sz w:val="24"/>
+          <w:szCs w:val="24"/>
+        </w:rPr>
+        <w:t xml:space="preserve"> A deep learning–based object detection model identifies pothole regions in each frame with low latency.</w:t>
+      </w:r>
+    </w:p>
+    <w:p>
+      <w:pPr>
+        <w:numPr>
+          <w:ilvl w:val="0"/>
+          <w:numId w:val="14"/>
+        </w:numPr>
+        <w:spacing w:after="0" w:line="240" w:lineRule="auto"/>
+        <w:jc w:val="both"/>
+        <w:rPr>
+          <w:rFonts w:ascii="Times New Roman" w:hAnsi="Times New Roman"/>
+          <w:iCs/>
+          <w:sz w:val="24"/>
+          <w:szCs w:val="24"/>
+        </w:rPr>
+      </w:pPr>
+      <w:r>
+        <w:rPr>
+          <w:rFonts w:ascii="Times New Roman" w:hAnsi="Times New Roman"/>
+          <w:b/>
+          <w:bCs/>
+          <w:iCs/>
+          <w:sz w:val="24"/>
+          <w:szCs w:val="24"/>
+        </w:rPr>
+        <w:t>Monocular Depth Estimation:</w:t>
+      </w:r>
+      <w:r>
+        <w:rPr>
+          <w:rFonts w:ascii="Times New Roman" w:hAnsi="Times New Roman"/>
+          <w:iCs/>
+          <w:sz w:val="24"/>
+          <w:szCs w:val="24"/>
+        </w:rPr>
+        <w:t xml:space="preserve"> Depth information is inferred directly from RGB images using monocular depth estimation techniques, eliminating the need for LiDAR.</w:t>
+      </w:r>
+    </w:p>
+    <w:p>
+      <w:pPr>
+        <w:numPr>
+          <w:ilvl w:val="0"/>
+          <w:numId w:val="14"/>
+        </w:numPr>
+        <w:spacing w:after="0" w:line="240" w:lineRule="auto"/>
+        <w:jc w:val="both"/>
+        <w:rPr>
+          <w:rFonts w:ascii="Times New Roman" w:hAnsi="Times New Roman"/>
+          <w:iCs/>
+          <w:sz w:val="24"/>
+          <w:szCs w:val="24"/>
+        </w:rPr>
+      </w:pPr>
+      <w:r>
+        <w:rPr>
+          <w:rFonts w:ascii="Times New Roman" w:hAnsi="Times New Roman"/>
+          <w:b/>
+          <w:bCs/>
+          <w:iCs/>
+          <w:sz w:val="24"/>
+          <w:szCs w:val="24"/>
+        </w:rPr>
+        <w:t>Wireframe Structural Modeling:</w:t>
+      </w:r>
+      <w:r>
+        <w:rPr>
+          <w:rFonts w:ascii="Times New Roman" w:hAnsi="Times New Roman"/>
+          <w:iCs/>
+          <w:sz w:val="24"/>
+          <w:szCs w:val="24"/>
+        </w:rPr>
+        <w:t xml:space="preserve"> Detected potholes are converted into wireframe representations capturing boundary shape, depth variation, and spatial extent.</w:t>
+      </w:r>
+    </w:p>
+    <w:p>
+      <w:pPr>
+        <w:numPr>
+          <w:ilvl w:val="0"/>
+          <w:numId w:val="14"/>
+        </w:numPr>
+        <w:spacing w:after="0" w:line="240" w:lineRule="auto"/>
+        <w:jc w:val="both"/>
+        <w:rPr>
+          <w:rFonts w:ascii="Times New Roman" w:hAnsi="Times New Roman"/>
+          <w:iCs/>
+          <w:sz w:val="24"/>
+          <w:szCs w:val="24"/>
+        </w:rPr>
+      </w:pPr>
+      <w:r>
+        <w:rPr>
+          <w:rFonts w:ascii="Times New Roman" w:hAnsi="Times New Roman"/>
+          <w:b/>
+          <w:bCs/>
+          <w:iCs/>
+          <w:sz w:val="24"/>
+          <w:szCs w:val="24"/>
+        </w:rPr>
+        <w:t>Severity Assessment:</w:t>
+      </w:r>
+      <w:r>
+        <w:rPr>
+          <w:rFonts w:ascii="Times New Roman" w:hAnsi="Times New Roman"/>
+          <w:iCs/>
+          <w:sz w:val="24"/>
+          <w:szCs w:val="24"/>
+        </w:rPr>
+        <w:t xml:space="preserve"> Structural features such as relative depth and affected area are analyzed to estimate pothole severity.</w:t>
+      </w:r>
+    </w:p>
+    <w:p>
+      <w:pPr>
+        <w:numPr>
+          <w:ilvl w:val="0"/>
+          <w:numId w:val="14"/>
+        </w:numPr>
+        <w:spacing w:after="0" w:line="240" w:lineRule="auto"/>
+        <w:jc w:val="both"/>
+        <w:rPr>
+          <w:rFonts w:ascii="Times New Roman" w:hAnsi="Times New Roman"/>
+          <w:iCs/>
+          <w:sz w:val="24"/>
+          <w:szCs w:val="24"/>
+        </w:rPr>
+      </w:pPr>
+      <w:r>
+        <w:rPr>
+          <w:rFonts w:ascii="Times New Roman" w:hAnsi="Times New Roman"/>
+          <w:b/>
+          <w:bCs/>
+          <w:iCs/>
+          <w:sz w:val="24"/>
+          <w:szCs w:val="24"/>
+        </w:rPr>
+        <w:t>Real-Time Processing:</w:t>
+      </w:r>
+      <w:r>
+        <w:rPr>
+          <w:rFonts w:ascii="Times New Roman" w:hAnsi="Times New Roman"/>
+          <w:iCs/>
+          <w:sz w:val="24"/>
+          <w:szCs w:val="24"/>
+        </w:rPr>
+        <w:t xml:space="preserve"> Region-of-interest–based processing and lightweight models ensure efficient execution under real-time constraints.</w:t>
+      </w:r>
+    </w:p>
+    <w:p>
+      <w:pPr>
+        <w:numPr>
+          <w:ilvl w:val="0"/>
+          <w:numId w:val="14"/>
+        </w:numPr>
+        <w:spacing w:after="0" w:line="240" w:lineRule="auto"/>
+        <w:jc w:val="both"/>
+        <w:rPr>
+          <w:rFonts w:ascii="Times New Roman" w:hAnsi="Times New Roman"/>
+          <w:iCs/>
+          <w:sz w:val="24"/>
+          <w:szCs w:val="24"/>
+        </w:rPr>
+      </w:pPr>
+      <w:r>
+        <w:rPr>
+          <w:rFonts w:ascii="Times New Roman" w:hAnsi="Times New Roman"/>
+          <w:b/>
+          <w:bCs/>
+          <w:iCs/>
+          <w:sz w:val="24"/>
+          <w:szCs w:val="24"/>
+        </w:rPr>
+        <w:t>Decision Support:</w:t>
+      </w:r>
+      <w:r>
+        <w:rPr>
+          <w:rFonts w:ascii="Times New Roman" w:hAnsi="Times New Roman"/>
+          <w:iCs/>
+          <w:sz w:val="24"/>
+          <w:szCs w:val="24"/>
+        </w:rPr>
+        <w:t xml:space="preserve"> The geometric representation enables proactive vehicle responses such as controlled deceleration or path adjustment.</w:t>
+      </w:r>
+    </w:p>
+    <w:p>
+      <w:pPr>
+        <w:numPr>
+          <w:ilvl w:val="0"/>
+          <w:numId w:val="14"/>
+        </w:numPr>
+        <w:spacing w:after="0" w:line="240" w:lineRule="auto"/>
+        <w:jc w:val="both"/>
+        <w:rPr>
+          <w:rFonts w:ascii="Times New Roman" w:hAnsi="Times New Roman"/>
+          <w:iCs/>
+          <w:sz w:val="24"/>
+          <w:szCs w:val="24"/>
+        </w:rPr>
+      </w:pPr>
+      <w:r>
+        <w:rPr>
+          <w:rFonts w:ascii="Times New Roman" w:hAnsi="Times New Roman"/>
+          <w:b/>
+          <w:bCs/>
+          <w:iCs/>
+          <w:sz w:val="24"/>
+          <w:szCs w:val="24"/>
+        </w:rPr>
+        <w:t>Scalability and Cost Efficiency:</w:t>
+      </w:r>
+      <w:r>
+        <w:rPr>
+          <w:rFonts w:ascii="Times New Roman" w:hAnsi="Times New Roman"/>
+          <w:iCs/>
+          <w:sz w:val="24"/>
+          <w:szCs w:val="24"/>
+        </w:rPr>
+        <w:t xml:space="preserve"> The camera-only design reduces hardware cost, power consumption, and system complexity, supporting large-scale deployment.</w:t>
+      </w:r>
+    </w:p>
+    <w:p>
+      <w:pPr>
+        <w:spacing w:after="0" w:line="240" w:lineRule="auto"/>
+        <w:ind w:left="360"/>
+        <w:jc w:val="both"/>
+        <w:rPr>
+          <w:rFonts w:ascii="Times New Roman" w:hAnsi="Times New Roman"/>
           <w:iCs/>
           <w:sz w:val="24"/>
           <w:szCs w:val="24"/>
@@ -17573,7 +17948,7 @@
           <w:noProof/>
         </w:rPr>
         <w:drawing>
-          <wp:inline distT="0" distB="0" distL="0" distR="0" wp14:anchorId="333131E1" wp14:editId="5105EF06">
+          <wp:inline distT="0" distB="0" distL="0" distR="0" wp14:anchorId="333131E1" wp14:editId="54683931">
             <wp:extent cx="5943600" cy="3509605"/>
             <wp:effectExtent l="0" t="0" r="0" b="0"/>
             <wp:docPr id="7" name="Picture 6">
@@ -17602,7 +17977,7 @@
                     </pic:cNvPicPr>
                   </pic:nvPicPr>
                   <pic:blipFill>
-                    <a:blip r:embed="rId9" cstate="print">
+                    <a:blip r:embed="rId11" cstate="print">
                       <a:extLst>
                         <a:ext uri="{28A0092B-C50C-407E-A947-70E740481C1C}">
                           <a14:useLocalDpi xmlns:a14="http://schemas.microsoft.com/office/drawing/2010/main" val="0"/>
@@ -17939,21 +18314,6 @@
     <w:p>
       <w:pPr>
         <w:pStyle w:val="ListParagraph"/>
-        <w:spacing w:after="0" w:line="240" w:lineRule="auto"/>
-        <w:ind w:left="780"/>
-        <w:rPr>
-          <w:rFonts w:ascii="Times New Roman" w:hAnsi="Times New Roman"/>
-          <w:b/>
-          <w:bCs/>
-          <w:iCs/>
-          <w:sz w:val="24"/>
-          <w:szCs w:val="24"/>
-        </w:rPr>
-      </w:pPr>
-    </w:p>
-    <w:p>
-      <w:pPr>
-        <w:pStyle w:val="ListParagraph"/>
         <w:numPr>
           <w:ilvl w:val="1"/>
           <w:numId w:val="7"/>
@@ -17998,6 +18358,229 @@
     <w:p>
       <w:pPr>
         <w:pStyle w:val="ListParagraph"/>
+        <w:numPr>
+          <w:ilvl w:val="0"/>
+          <w:numId w:val="14"/>
+        </w:numPr>
+        <w:spacing w:after="0"/>
+        <w:jc w:val="both"/>
+        <w:rPr>
+          <w:rFonts w:ascii="Times New Roman" w:hAnsi="Times New Roman"/>
+          <w:iCs/>
+          <w:sz w:val="24"/>
+          <w:szCs w:val="24"/>
+        </w:rPr>
+      </w:pPr>
+      <w:r>
+        <w:rPr>
+          <w:rFonts w:ascii="Times New Roman" w:hAnsi="Times New Roman"/>
+          <w:b/>
+          <w:bCs/>
+          <w:iCs/>
+          <w:sz w:val="24"/>
+          <w:szCs w:val="24"/>
+        </w:rPr>
+        <w:t>Temporal Modeling:</w:t>
+      </w:r>
+      <w:r>
+        <w:rPr>
+          <w:rFonts w:ascii="Times New Roman" w:hAnsi="Times New Roman"/>
+          <w:iCs/>
+          <w:sz w:val="24"/>
+          <w:szCs w:val="24"/>
+        </w:rPr>
+        <w:t xml:space="preserve"> Integrating temporal learning models such as RNNs or video transformers can improve detection stability and wireframe consistency across consecutive frames, especially during high-speed motion.</w:t>
+      </w:r>
+    </w:p>
+    <w:p>
+      <w:pPr>
+        <w:pStyle w:val="ListParagraph"/>
+        <w:numPr>
+          <w:ilvl w:val="0"/>
+          <w:numId w:val="14"/>
+        </w:numPr>
+        <w:spacing w:after="0"/>
+        <w:jc w:val="both"/>
+        <w:rPr>
+          <w:rFonts w:ascii="Times New Roman" w:hAnsi="Times New Roman"/>
+          <w:iCs/>
+          <w:sz w:val="24"/>
+          <w:szCs w:val="24"/>
+        </w:rPr>
+      </w:pPr>
+      <w:r>
+        <w:rPr>
+          <w:rFonts w:ascii="Times New Roman" w:hAnsi="Times New Roman"/>
+          <w:b/>
+          <w:bCs/>
+          <w:iCs/>
+          <w:sz w:val="24"/>
+          <w:szCs w:val="24"/>
+        </w:rPr>
+        <w:t>Metric Depth Estimation</w:t>
+      </w:r>
+      <w:r>
+        <w:rPr>
+          <w:rFonts w:ascii="Times New Roman" w:hAnsi="Times New Roman"/>
+          <w:iCs/>
+          <w:sz w:val="24"/>
+          <w:szCs w:val="24"/>
+        </w:rPr>
+        <w:t>: Camera calibration and scale recovery techniques can be applied to obtain metric depth values, enabling accurate estimation of pothole depth and volume for better severity analysis.</w:t>
+      </w:r>
+    </w:p>
+    <w:p>
+      <w:pPr>
+        <w:pStyle w:val="ListParagraph"/>
+        <w:numPr>
+          <w:ilvl w:val="0"/>
+          <w:numId w:val="14"/>
+        </w:numPr>
+        <w:spacing w:after="0"/>
+        <w:jc w:val="both"/>
+        <w:rPr>
+          <w:rFonts w:ascii="Times New Roman" w:hAnsi="Times New Roman"/>
+          <w:iCs/>
+          <w:sz w:val="24"/>
+          <w:szCs w:val="24"/>
+        </w:rPr>
+      </w:pPr>
+      <w:r>
+        <w:rPr>
+          <w:rFonts w:ascii="Times New Roman" w:hAnsi="Times New Roman"/>
+          <w:b/>
+          <w:bCs/>
+          <w:iCs/>
+          <w:sz w:val="24"/>
+          <w:szCs w:val="24"/>
+        </w:rPr>
+        <w:t>Multi-Defect Detection:</w:t>
+      </w:r>
+      <w:r>
+        <w:rPr>
+          <w:rFonts w:ascii="Times New Roman" w:hAnsi="Times New Roman"/>
+          <w:iCs/>
+          <w:sz w:val="24"/>
+          <w:szCs w:val="24"/>
+        </w:rPr>
+        <w:t xml:space="preserve"> The system can be extended to detect and structurally model other road anomalies such as cracks, bumps, and uneven pavement using a unified geometric framework.</w:t>
+      </w:r>
+    </w:p>
+    <w:p>
+      <w:pPr>
+        <w:pStyle w:val="ListParagraph"/>
+        <w:numPr>
+          <w:ilvl w:val="0"/>
+          <w:numId w:val="14"/>
+        </w:numPr>
+        <w:spacing w:after="0"/>
+        <w:jc w:val="both"/>
+        <w:rPr>
+          <w:rFonts w:ascii="Times New Roman" w:hAnsi="Times New Roman"/>
+          <w:iCs/>
+          <w:sz w:val="24"/>
+          <w:szCs w:val="24"/>
+        </w:rPr>
+      </w:pPr>
+      <w:r>
+        <w:rPr>
+          <w:rFonts w:ascii="Times New Roman" w:hAnsi="Times New Roman"/>
+          <w:b/>
+          <w:bCs/>
+          <w:iCs/>
+          <w:sz w:val="24"/>
+          <w:szCs w:val="24"/>
+        </w:rPr>
+        <w:lastRenderedPageBreak/>
+        <w:t>Vehicle Dynamics Integration:</w:t>
+      </w:r>
+      <w:r>
+        <w:rPr>
+          <w:rFonts w:ascii="Times New Roman" w:hAnsi="Times New Roman"/>
+          <w:iCs/>
+          <w:sz w:val="24"/>
+          <w:szCs w:val="24"/>
+        </w:rPr>
+        <w:t xml:space="preserve"> Incorporating vehicle speed and suspension feedback can refine decision thresholds and enhance depth estimation accuracy in real time.</w:t>
+      </w:r>
+    </w:p>
+    <w:p>
+      <w:pPr>
+        <w:pStyle w:val="ListParagraph"/>
+        <w:numPr>
+          <w:ilvl w:val="0"/>
+          <w:numId w:val="14"/>
+        </w:numPr>
+        <w:spacing w:after="0"/>
+        <w:jc w:val="both"/>
+        <w:rPr>
+          <w:rFonts w:ascii="Times New Roman" w:hAnsi="Times New Roman"/>
+          <w:iCs/>
+          <w:sz w:val="24"/>
+          <w:szCs w:val="24"/>
+        </w:rPr>
+      </w:pPr>
+      <w:r>
+        <w:rPr>
+          <w:rFonts w:ascii="Times New Roman" w:hAnsi="Times New Roman"/>
+          <w:b/>
+          <w:bCs/>
+          <w:iCs/>
+          <w:sz w:val="24"/>
+          <w:szCs w:val="24"/>
+        </w:rPr>
+        <w:t>Crowdsourced Road Monitoring:</w:t>
+      </w:r>
+      <w:r>
+        <w:rPr>
+          <w:rFonts w:ascii="Times New Roman" w:hAnsi="Times New Roman"/>
+          <w:iCs/>
+          <w:sz w:val="24"/>
+          <w:szCs w:val="24"/>
+        </w:rPr>
+        <w:t xml:space="preserve"> Data collected from multiple vehicles can be aggregated and mapped to support large-scale road condition monitoring and predictive maintenance.</w:t>
+      </w:r>
+    </w:p>
+    <w:p>
+      <w:pPr>
+        <w:pStyle w:val="ListParagraph"/>
+        <w:numPr>
+          <w:ilvl w:val="0"/>
+          <w:numId w:val="14"/>
+        </w:numPr>
+        <w:spacing w:after="0"/>
+        <w:jc w:val="both"/>
+        <w:rPr>
+          <w:rFonts w:ascii="Times New Roman" w:hAnsi="Times New Roman"/>
+          <w:iCs/>
+          <w:sz w:val="24"/>
+          <w:szCs w:val="24"/>
+        </w:rPr>
+      </w:pPr>
+      <w:r>
+        <w:rPr>
+          <w:rFonts w:ascii="Times New Roman" w:hAnsi="Times New Roman"/>
+          <w:b/>
+          <w:bCs/>
+          <w:iCs/>
+          <w:sz w:val="24"/>
+          <w:szCs w:val="24"/>
+        </w:rPr>
+        <w:t>Edge and Embedded Optimization:</w:t>
+      </w:r>
+      <w:r>
+        <w:rPr>
+          <w:rFonts w:ascii="Times New Roman" w:hAnsi="Times New Roman"/>
+          <w:iCs/>
+          <w:sz w:val="24"/>
+          <w:szCs w:val="24"/>
+        </w:rPr>
+        <w:t xml:space="preserve"> Model compression and hardware-specific acceleration can enable efficient deployment on embedded and automotive-grade platforms.</w:t>
+      </w:r>
+    </w:p>
+    <w:p>
+      <w:pPr>
+        <w:pStyle w:val="ListParagraph"/>
         <w:spacing w:after="0" w:line="240" w:lineRule="auto"/>
         <w:ind w:left="780"/>
         <w:rPr>
@@ -18154,7 +18737,7 @@
         </w:rPr>
         <w:t xml:space="preserve">[1] </w:t>
       </w:r>
-      <w:hyperlink r:id="rId10" w:history="1">
+      <w:hyperlink r:id="rId12" w:history="1">
         <w:r>
           <w:rPr>
             <w:rStyle w:val="Hyperlink"/>
@@ -18208,7 +18791,7 @@
         </w:rPr>
         <w:t xml:space="preserve">[2] </w:t>
       </w:r>
-      <w:hyperlink r:id="rId11" w:history="1">
+      <w:hyperlink r:id="rId13" w:history="1">
         <w:r>
           <w:rPr>
             <w:rStyle w:val="Hyperlink"/>
@@ -18262,7 +18845,7 @@
         </w:rPr>
         <w:t xml:space="preserve">[3] </w:t>
       </w:r>
-      <w:hyperlink r:id="rId12" w:history="1">
+      <w:hyperlink r:id="rId14" w:history="1">
         <w:r>
           <w:rPr>
             <w:rStyle w:val="Hyperlink"/>
@@ -18316,7 +18899,7 @@
         </w:rPr>
         <w:t xml:space="preserve">[4] </w:t>
       </w:r>
-      <w:hyperlink r:id="rId13" w:history="1">
+      <w:hyperlink r:id="rId15" w:history="1">
         <w:r>
           <w:rPr>
             <w:rStyle w:val="Hyperlink"/>
@@ -18370,7 +18953,7 @@
         </w:rPr>
         <w:t xml:space="preserve">[5] </w:t>
       </w:r>
-      <w:hyperlink r:id="rId14" w:history="1">
+      <w:hyperlink r:id="rId16" w:history="1">
         <w:r>
           <w:rPr>
             <w:rStyle w:val="Hyperlink"/>
@@ -18424,7 +19007,7 @@
         </w:rPr>
         <w:t xml:space="preserve">[6] </w:t>
       </w:r>
-      <w:hyperlink r:id="rId15" w:history="1">
+      <w:hyperlink r:id="rId17" w:history="1">
         <w:r>
           <w:rPr>
             <w:rStyle w:val="Hyperlink"/>
@@ -18440,7 +19023,6 @@
       </w:hyperlink>
     </w:p>
     <w:sectPr>
-      <w:footerReference w:type="default" r:id="rId16"/>
       <w:pgSz w:w="12240" w:h="15840"/>
       <w:pgMar w:top="994" w:right="1440" w:bottom="806" w:left="1440" w:header="720" w:footer="720" w:gutter="0"/>
       <w:cols w:space="720"/>
@@ -18513,6 +19095,119 @@
 <file path=word/numbering.xml><?xml version="1.0" encoding="utf-8"?>
 <w:numbering xmlns:wpc="http://schemas.microsoft.com/office/word/2010/wordprocessingCanvas" xmlns:cx="http://schemas.microsoft.com/office/drawing/2014/chartex" xmlns:cx1="http://schemas.microsoft.com/office/drawing/2015/9/8/chartex" xmlns:cx2="http://schemas.microsoft.com/office/drawing/2015/10/21/chartex" xmlns:cx3="http://schemas.microsoft.com/office/drawing/2016/5/9/chartex" xmlns:cx4="http://schemas.microsoft.com/office/drawing/2016/5/10/chartex" xmlns:cx5="http://schemas.microsoft.com/office/drawing/2016/5/11/chartex" xmlns:cx6="http://schemas.microsoft.com/office/drawing/2016/5/12/chartex" xmlns:cx7="http://schemas.microsoft.com/office/drawing/2016/5/13/chartex" xmlns:cx8="http://schemas.microsoft.com/office/drawing/2016/5/14/chartex" xmlns:mc="http://schemas.openxmlformats.org/markup-compatibility/2006" xmlns:aink="http://schemas.microsoft.com/office/drawing/2016/ink" xmlns:am3d="http://schemas.microsoft.com/office/drawing/2017/model3d" xmlns:o="urn:schemas-microsoft-com:office:office" xmlns:oel="http://schemas.microsoft.com/office/2019/extlst" xmlns:r="http://schemas.openxmlformats.org/officeDocument/2006/relationships" xmlns:m="http://schemas.openxmlformats.org/officeDocument/2006/math" xmlns:v="urn:schemas-microsoft-com:vml" xmlns:wp14="http://schemas.microsoft.com/office/word/2010/wordprocessingDrawing" xmlns:wp="http://schemas.openxmlformats.org/drawingml/2006/wordprocessingDrawing" xmlns:w10="urn:schemas-microsoft-com:office:word" xmlns:w="http://schemas.openxmlformats.org/wordprocessingml/2006/main" xmlns:w14="http://schemas.microsoft.com/office/word/2010/wordml" xmlns:w15="http://schemas.microsoft.com/office/word/2012/wordml" xmlns:w16cex="http://schemas.microsoft.com/office/word/2018/wordml/cex" xmlns:w16cid="http://schemas.microsoft.com/office/word/2016/wordml/cid" xmlns:w16="http://schemas.microsoft.com/office/word/2018/wordml" xmlns:w16du="http://schemas.microsoft.com/office/word/2023/wordml/word16du" xmlns:w16sdtdh="http://schemas.microsoft.com/office/word/2020/wordml/sdtdatahash" xmlns:w16sdtfl="http://schemas.microsoft.com/office/word/2024/wordml/sdtformatlock" xmlns:w16se="http://schemas.microsoft.com/office/word/2015/wordml/symex" xmlns:wpg="http://schemas.microsoft.com/office/word/2010/wordprocessingGroup" xmlns:wpi="http://schemas.microsoft.com/office/word/2010/wordprocessingInk" xmlns:wne="http://schemas.microsoft.com/office/word/2006/wordml" xmlns:wps="http://schemas.microsoft.com/office/word/2010/wordprocessingShape" mc:Ignorable="w14 w15 w16se w16cid w16 w16cex w16sdtdh w16sdtfl w16du wp14">
   <w:abstractNum w:abstractNumId="0" w15:restartNumberingAfterBreak="0">
+    <w:nsid w:val="1D0510E3"/>
+    <w:multiLevelType w:val="hybridMultilevel"/>
+    <w:tmpl w:val="107E1078"/>
+    <w:lvl w:ilvl="0" w:tplc="04090001">
+      <w:start w:val="1"/>
+      <w:numFmt w:val="bullet"/>
+      <w:lvlText w:val=""/>
+      <w:lvlJc w:val="left"/>
+      <w:pPr>
+        <w:ind w:left="1500" w:hanging="360"/>
+      </w:pPr>
+      <w:rPr>
+        <w:rFonts w:ascii="Symbol" w:hAnsi="Symbol" w:hint="default"/>
+      </w:rPr>
+    </w:lvl>
+    <w:lvl w:ilvl="1" w:tplc="04090003" w:tentative="1">
+      <w:start w:val="1"/>
+      <w:numFmt w:val="bullet"/>
+      <w:lvlText w:val="o"/>
+      <w:lvlJc w:val="left"/>
+      <w:pPr>
+        <w:ind w:left="2220" w:hanging="360"/>
+      </w:pPr>
+      <w:rPr>
+        <w:rFonts w:ascii="Courier New" w:hAnsi="Courier New" w:cs="Courier New" w:hint="default"/>
+      </w:rPr>
+    </w:lvl>
+    <w:lvl w:ilvl="2" w:tplc="04090005" w:tentative="1">
+      <w:start w:val="1"/>
+      <w:numFmt w:val="bullet"/>
+      <w:lvlText w:val=""/>
+      <w:lvlJc w:val="left"/>
+      <w:pPr>
+        <w:ind w:left="2940" w:hanging="360"/>
+      </w:pPr>
+      <w:rPr>
+        <w:rFonts w:ascii="Wingdings" w:hAnsi="Wingdings" w:hint="default"/>
+      </w:rPr>
+    </w:lvl>
+    <w:lvl w:ilvl="3" w:tplc="04090001" w:tentative="1">
+      <w:start w:val="1"/>
+      <w:numFmt w:val="bullet"/>
+      <w:lvlText w:val=""/>
+      <w:lvlJc w:val="left"/>
+      <w:pPr>
+        <w:ind w:left="3660" w:hanging="360"/>
+      </w:pPr>
+      <w:rPr>
+        <w:rFonts w:ascii="Symbol" w:hAnsi="Symbol" w:hint="default"/>
+      </w:rPr>
+    </w:lvl>
+    <w:lvl w:ilvl="4" w:tplc="04090003" w:tentative="1">
+      <w:start w:val="1"/>
+      <w:numFmt w:val="bullet"/>
+      <w:lvlText w:val="o"/>
+      <w:lvlJc w:val="left"/>
+      <w:pPr>
+        <w:ind w:left="4380" w:hanging="360"/>
+      </w:pPr>
+      <w:rPr>
+        <w:rFonts w:ascii="Courier New" w:hAnsi="Courier New" w:cs="Courier New" w:hint="default"/>
+      </w:rPr>
+    </w:lvl>
+    <w:lvl w:ilvl="5" w:tplc="04090005" w:tentative="1">
+      <w:start w:val="1"/>
+      <w:numFmt w:val="bullet"/>
+      <w:lvlText w:val=""/>
+      <w:lvlJc w:val="left"/>
+      <w:pPr>
+        <w:ind w:left="5100" w:hanging="360"/>
+      </w:pPr>
+      <w:rPr>
+        <w:rFonts w:ascii="Wingdings" w:hAnsi="Wingdings" w:hint="default"/>
+      </w:rPr>
+    </w:lvl>
+    <w:lvl w:ilvl="6" w:tplc="04090001" w:tentative="1">
+      <w:start w:val="1"/>
+      <w:numFmt w:val="bullet"/>
+      <w:lvlText w:val=""/>
+      <w:lvlJc w:val="left"/>
+      <w:pPr>
+        <w:ind w:left="5820" w:hanging="360"/>
+      </w:pPr>
+      <w:rPr>
+        <w:rFonts w:ascii="Symbol" w:hAnsi="Symbol" w:hint="default"/>
+      </w:rPr>
+    </w:lvl>
+    <w:lvl w:ilvl="7" w:tplc="04090003" w:tentative="1">
+      <w:start w:val="1"/>
+      <w:numFmt w:val="bullet"/>
+      <w:lvlText w:val="o"/>
+      <w:lvlJc w:val="left"/>
+      <w:pPr>
+        <w:ind w:left="6540" w:hanging="360"/>
+      </w:pPr>
+      <w:rPr>
+        <w:rFonts w:ascii="Courier New" w:hAnsi="Courier New" w:cs="Courier New" w:hint="default"/>
+      </w:rPr>
+    </w:lvl>
+    <w:lvl w:ilvl="8" w:tplc="04090005" w:tentative="1">
+      <w:start w:val="1"/>
+      <w:numFmt w:val="bullet"/>
+      <w:lvlText w:val=""/>
+      <w:lvlJc w:val="left"/>
+      <w:pPr>
+        <w:ind w:left="7260" w:hanging="360"/>
+      </w:pPr>
+      <w:rPr>
+        <w:rFonts w:ascii="Wingdings" w:hAnsi="Wingdings" w:hint="default"/>
+      </w:rPr>
+    </w:lvl>
+  </w:abstractNum>
+  <w:abstractNum w:abstractNumId="1" w15:restartNumberingAfterBreak="0">
     <w:nsid w:val="2E505FAB"/>
     <w:multiLevelType w:val="hybridMultilevel"/>
     <w:tmpl w:val="7DBE4064"/>
@@ -18601,7 +19296,7 @@
       </w:pPr>
     </w:lvl>
   </w:abstractNum>
-  <w:abstractNum w:abstractNumId="1" w15:restartNumberingAfterBreak="0">
+  <w:abstractNum w:abstractNumId="2" w15:restartNumberingAfterBreak="0">
     <w:nsid w:val="33F90AD2"/>
     <w:multiLevelType w:val="hybridMultilevel"/>
     <w:tmpl w:val="AA724AF6"/>
@@ -18691,7 +19386,156 @@
       </w:pPr>
     </w:lvl>
   </w:abstractNum>
-  <w:abstractNum w:abstractNumId="2" w15:restartNumberingAfterBreak="0">
+  <w:abstractNum w:abstractNumId="3" w15:restartNumberingAfterBreak="0">
+    <w:nsid w:val="365D5E68"/>
+    <w:multiLevelType w:val="multilevel"/>
+    <w:tmpl w:val="20222712"/>
+    <w:lvl w:ilvl="0">
+      <w:start w:val="1"/>
+      <w:numFmt w:val="bullet"/>
+      <w:lvlText w:val=""/>
+      <w:lvlJc w:val="left"/>
+      <w:pPr>
+        <w:tabs>
+          <w:tab w:val="num" w:pos="720"/>
+        </w:tabs>
+        <w:ind w:left="720" w:hanging="360"/>
+      </w:pPr>
+      <w:rPr>
+        <w:rFonts w:ascii="Symbol" w:hAnsi="Symbol" w:hint="default"/>
+        <w:sz w:val="20"/>
+      </w:rPr>
+    </w:lvl>
+    <w:lvl w:ilvl="1" w:tentative="1">
+      <w:start w:val="1"/>
+      <w:numFmt w:val="bullet"/>
+      <w:lvlText w:val="o"/>
+      <w:lvlJc w:val="left"/>
+      <w:pPr>
+        <w:tabs>
+          <w:tab w:val="num" w:pos="1440"/>
+        </w:tabs>
+        <w:ind w:left="1440" w:hanging="360"/>
+      </w:pPr>
+      <w:rPr>
+        <w:rFonts w:ascii="Courier New" w:hAnsi="Courier New" w:hint="default"/>
+        <w:sz w:val="20"/>
+      </w:rPr>
+    </w:lvl>
+    <w:lvl w:ilvl="2" w:tentative="1">
+      <w:start w:val="1"/>
+      <w:numFmt w:val="bullet"/>
+      <w:lvlText w:val=""/>
+      <w:lvlJc w:val="left"/>
+      <w:pPr>
+        <w:tabs>
+          <w:tab w:val="num" w:pos="2160"/>
+        </w:tabs>
+        <w:ind w:left="2160" w:hanging="360"/>
+      </w:pPr>
+      <w:rPr>
+        <w:rFonts w:ascii="Wingdings" w:hAnsi="Wingdings" w:hint="default"/>
+        <w:sz w:val="20"/>
+      </w:rPr>
+    </w:lvl>
+    <w:lvl w:ilvl="3" w:tentative="1">
+      <w:start w:val="1"/>
+      <w:numFmt w:val="bullet"/>
+      <w:lvlText w:val=""/>
+      <w:lvlJc w:val="left"/>
+      <w:pPr>
+        <w:tabs>
+          <w:tab w:val="num" w:pos="2880"/>
+        </w:tabs>
+        <w:ind w:left="2880" w:hanging="360"/>
+      </w:pPr>
+      <w:rPr>
+        <w:rFonts w:ascii="Wingdings" w:hAnsi="Wingdings" w:hint="default"/>
+        <w:sz w:val="20"/>
+      </w:rPr>
+    </w:lvl>
+    <w:lvl w:ilvl="4" w:tentative="1">
+      <w:start w:val="1"/>
+      <w:numFmt w:val="bullet"/>
+      <w:lvlText w:val=""/>
+      <w:lvlJc w:val="left"/>
+      <w:pPr>
+        <w:tabs>
+          <w:tab w:val="num" w:pos="3600"/>
+        </w:tabs>
+        <w:ind w:left="3600" w:hanging="360"/>
+      </w:pPr>
+      <w:rPr>
+        <w:rFonts w:ascii="Wingdings" w:hAnsi="Wingdings" w:hint="default"/>
+        <w:sz w:val="20"/>
+      </w:rPr>
+    </w:lvl>
+    <w:lvl w:ilvl="5" w:tentative="1">
+      <w:start w:val="1"/>
+      <w:numFmt w:val="bullet"/>
+      <w:lvlText w:val=""/>
+      <w:lvlJc w:val="left"/>
+      <w:pPr>
+        <w:tabs>
+          <w:tab w:val="num" w:pos="4320"/>
+        </w:tabs>
+        <w:ind w:left="4320" w:hanging="360"/>
+      </w:pPr>
+      <w:rPr>
+        <w:rFonts w:ascii="Wingdings" w:hAnsi="Wingdings" w:hint="default"/>
+        <w:sz w:val="20"/>
+      </w:rPr>
+    </w:lvl>
+    <w:lvl w:ilvl="6" w:tentative="1">
+      <w:start w:val="1"/>
+      <w:numFmt w:val="bullet"/>
+      <w:lvlText w:val=""/>
+      <w:lvlJc w:val="left"/>
+      <w:pPr>
+        <w:tabs>
+          <w:tab w:val="num" w:pos="5040"/>
+        </w:tabs>
+        <w:ind w:left="5040" w:hanging="360"/>
+      </w:pPr>
+      <w:rPr>
+        <w:rFonts w:ascii="Wingdings" w:hAnsi="Wingdings" w:hint="default"/>
+        <w:sz w:val="20"/>
+      </w:rPr>
+    </w:lvl>
+    <w:lvl w:ilvl="7" w:tentative="1">
+      <w:start w:val="1"/>
+      <w:numFmt w:val="bullet"/>
+      <w:lvlText w:val=""/>
+      <w:lvlJc w:val="left"/>
+      <w:pPr>
+        <w:tabs>
+          <w:tab w:val="num" w:pos="5760"/>
+        </w:tabs>
+        <w:ind w:left="5760" w:hanging="360"/>
+      </w:pPr>
+      <w:rPr>
+        <w:rFonts w:ascii="Wingdings" w:hAnsi="Wingdings" w:hint="default"/>
+        <w:sz w:val="20"/>
+      </w:rPr>
+    </w:lvl>
+    <w:lvl w:ilvl="8" w:tentative="1">
+      <w:start w:val="1"/>
+      <w:numFmt w:val="bullet"/>
+      <w:lvlText w:val=""/>
+      <w:lvlJc w:val="left"/>
+      <w:pPr>
+        <w:tabs>
+          <w:tab w:val="num" w:pos="6480"/>
+        </w:tabs>
+        <w:ind w:left="6480" w:hanging="360"/>
+      </w:pPr>
+      <w:rPr>
+        <w:rFonts w:ascii="Wingdings" w:hAnsi="Wingdings" w:hint="default"/>
+        <w:sz w:val="20"/>
+      </w:rPr>
+    </w:lvl>
+  </w:abstractNum>
+  <w:abstractNum w:abstractNumId="4" w15:restartNumberingAfterBreak="0">
     <w:nsid w:val="44AB1982"/>
     <w:multiLevelType w:val="hybridMultilevel"/>
     <w:tmpl w:val="A06AA390"/>
@@ -18780,7 +19624,7 @@
       </w:pPr>
     </w:lvl>
   </w:abstractNum>
-  <w:abstractNum w:abstractNumId="3" w15:restartNumberingAfterBreak="0">
+  <w:abstractNum w:abstractNumId="5" w15:restartNumberingAfterBreak="0">
     <w:nsid w:val="474F537F"/>
     <w:multiLevelType w:val="multilevel"/>
     <w:tmpl w:val="F1EA39B8"/>
@@ -18902,7 +19746,7 @@
       </w:rPr>
     </w:lvl>
   </w:abstractNum>
-  <w:abstractNum w:abstractNumId="4" w15:restartNumberingAfterBreak="0">
+  <w:abstractNum w:abstractNumId="6" w15:restartNumberingAfterBreak="0">
     <w:nsid w:val="4F0B25CD"/>
     <w:multiLevelType w:val="hybridMultilevel"/>
     <w:tmpl w:val="F6886826"/>
@@ -18993,7 +19837,7 @@
       </w:pPr>
     </w:lvl>
   </w:abstractNum>
-  <w:abstractNum w:abstractNumId="5" w15:restartNumberingAfterBreak="0">
+  <w:abstractNum w:abstractNumId="7" w15:restartNumberingAfterBreak="0">
     <w:nsid w:val="52072D84"/>
     <w:multiLevelType w:val="multilevel"/>
     <w:tmpl w:val="21865FBA"/>
@@ -19114,7 +19958,7 @@
       </w:rPr>
     </w:lvl>
   </w:abstractNum>
-  <w:abstractNum w:abstractNumId="6" w15:restartNumberingAfterBreak="0">
+  <w:abstractNum w:abstractNumId="8" w15:restartNumberingAfterBreak="0">
     <w:nsid w:val="55381554"/>
     <w:multiLevelType w:val="hybridMultilevel"/>
     <w:tmpl w:val="6860B320"/>
@@ -19205,7 +20049,7 @@
       </w:pPr>
     </w:lvl>
   </w:abstractNum>
-  <w:abstractNum w:abstractNumId="7" w15:restartNumberingAfterBreak="0">
+  <w:abstractNum w:abstractNumId="9" w15:restartNumberingAfterBreak="0">
     <w:nsid w:val="5E437104"/>
     <w:multiLevelType w:val="multilevel"/>
     <w:tmpl w:val="BB3A5028"/>
@@ -19326,7 +20170,7 @@
       </w:rPr>
     </w:lvl>
   </w:abstractNum>
-  <w:abstractNum w:abstractNumId="8" w15:restartNumberingAfterBreak="0">
+  <w:abstractNum w:abstractNumId="10" w15:restartNumberingAfterBreak="0">
     <w:nsid w:val="5FC96EF2"/>
     <w:multiLevelType w:val="hybridMultilevel"/>
     <w:tmpl w:val="70784E80"/>
@@ -19415,7 +20259,7 @@
       </w:pPr>
     </w:lvl>
   </w:abstractNum>
-  <w:abstractNum w:abstractNumId="9" w15:restartNumberingAfterBreak="0">
+  <w:abstractNum w:abstractNumId="11" w15:restartNumberingAfterBreak="0">
     <w:nsid w:val="62DD7246"/>
     <w:multiLevelType w:val="hybridMultilevel"/>
     <w:tmpl w:val="DFBE0030"/>
@@ -19505,7 +20349,7 @@
       </w:pPr>
     </w:lvl>
   </w:abstractNum>
-  <w:abstractNum w:abstractNumId="10" w15:restartNumberingAfterBreak="0">
+  <w:abstractNum w:abstractNumId="12" w15:restartNumberingAfterBreak="0">
     <w:nsid w:val="6C91355D"/>
     <w:multiLevelType w:val="hybridMultilevel"/>
     <w:tmpl w:val="F44A5570"/>
@@ -19596,7 +20440,7 @@
       </w:pPr>
     </w:lvl>
   </w:abstractNum>
-  <w:abstractNum w:abstractNumId="11" w15:restartNumberingAfterBreak="0">
+  <w:abstractNum w:abstractNumId="13" w15:restartNumberingAfterBreak="0">
     <w:nsid w:val="743B5570"/>
     <w:multiLevelType w:val="multilevel"/>
     <w:tmpl w:val="D99A958E"/>
@@ -19709,7 +20553,7 @@
       </w:rPr>
     </w:lvl>
   </w:abstractNum>
-  <w:abstractNum w:abstractNumId="12" w15:restartNumberingAfterBreak="0">
+  <w:abstractNum w:abstractNumId="14" w15:restartNumberingAfterBreak="0">
     <w:nsid w:val="7C0939CE"/>
     <w:multiLevelType w:val="multilevel"/>
     <w:tmpl w:val="6EDA3510"/>
@@ -19831,43 +20675,49 @@
     </w:lvl>
   </w:abstractNum>
   <w:num w:numId="1" w16cid:durableId="216665290">
+    <w:abstractNumId w:val="4"/>
+  </w:num>
+  <w:num w:numId="2" w16cid:durableId="2089571173">
+    <w:abstractNumId w:val="5"/>
+  </w:num>
+  <w:num w:numId="3" w16cid:durableId="986784588">
+    <w:abstractNumId w:val="9"/>
+  </w:num>
+  <w:num w:numId="4" w16cid:durableId="996031407">
+    <w:abstractNumId w:val="11"/>
+  </w:num>
+  <w:num w:numId="5" w16cid:durableId="2064061923">
+    <w:abstractNumId w:val="13"/>
+  </w:num>
+  <w:num w:numId="6" w16cid:durableId="1297099782">
+    <w:abstractNumId w:val="7"/>
+  </w:num>
+  <w:num w:numId="7" w16cid:durableId="630474358">
+    <w:abstractNumId w:val="14"/>
+  </w:num>
+  <w:num w:numId="8" w16cid:durableId="2143960523">
+    <w:abstractNumId w:val="6"/>
+  </w:num>
+  <w:num w:numId="9" w16cid:durableId="1854491143">
+    <w:abstractNumId w:val="12"/>
+  </w:num>
+  <w:num w:numId="10" w16cid:durableId="338511850">
+    <w:abstractNumId w:val="8"/>
+  </w:num>
+  <w:num w:numId="11" w16cid:durableId="1228685140">
     <w:abstractNumId w:val="2"/>
   </w:num>
-  <w:num w:numId="2" w16cid:durableId="2089571173">
+  <w:num w:numId="12" w16cid:durableId="854153345">
+    <w:abstractNumId w:val="1"/>
+  </w:num>
+  <w:num w:numId="13" w16cid:durableId="608506939">
+    <w:abstractNumId w:val="10"/>
+  </w:num>
+  <w:num w:numId="14" w16cid:durableId="602883428">
     <w:abstractNumId w:val="3"/>
   </w:num>
-  <w:num w:numId="3" w16cid:durableId="986784588">
-    <w:abstractNumId w:val="7"/>
-  </w:num>
-  <w:num w:numId="4" w16cid:durableId="996031407">
-    <w:abstractNumId w:val="9"/>
-  </w:num>
-  <w:num w:numId="5" w16cid:durableId="2064061923">
-    <w:abstractNumId w:val="11"/>
-  </w:num>
-  <w:num w:numId="6" w16cid:durableId="1297099782">
-    <w:abstractNumId w:val="5"/>
-  </w:num>
-  <w:num w:numId="7" w16cid:durableId="630474358">
-    <w:abstractNumId w:val="12"/>
-  </w:num>
-  <w:num w:numId="8" w16cid:durableId="2143960523">
-    <w:abstractNumId w:val="4"/>
-  </w:num>
-  <w:num w:numId="9" w16cid:durableId="1854491143">
-    <w:abstractNumId w:val="10"/>
-  </w:num>
-  <w:num w:numId="10" w16cid:durableId="338511850">
-    <w:abstractNumId w:val="6"/>
-  </w:num>
-  <w:num w:numId="11" w16cid:durableId="1228685140">
-    <w:abstractNumId w:val="1"/>
-  </w:num>
-  <w:num w:numId="12" w16cid:durableId="854153345">
+  <w:num w:numId="15" w16cid:durableId="407388031">
     <w:abstractNumId w:val="0"/>
-  </w:num>
-  <w:num w:numId="13" w16cid:durableId="608506939">
-    <w:abstractNumId w:val="8"/>
   </w:num>
 </w:numbering>
 </file>
@@ -20409,7 +21259,6 @@
     <w:basedOn w:val="Normal"/>
     <w:link w:val="HeaderChar"/>
     <w:uiPriority w:val="99"/>
-    <w:semiHidden/>
     <w:unhideWhenUsed/>
     <w:rsid w:val="004F7F94"/>
     <w:pPr>
@@ -20424,7 +21273,6 @@
     <w:basedOn w:val="DefaultParagraphFont"/>
     <w:link w:val="Header"/>
     <w:uiPriority w:val="99"/>
-    <w:semiHidden/>
     <w:rsid w:val="004F7F94"/>
     <w:rPr>
       <w:sz w:val="22"/>

</xml_diff>